<commit_message>
Commit del 16 Ottobre
</commit_message>
<xml_diff>
--- a/4_Diari/261016 Diario Leonardo Montini.docx
+++ b/4_Diari/261016 Diario Leonardo Montini.docx
@@ -307,7 +307,19 @@
               <w:rPr>
                 <w:rFonts w:ascii="Arial" w:hAnsi="Arial" w:cs="Arial"/>
               </w:rPr>
-              <w:t>11:12 – 11:35</w:t>
+              <w:t>11:1</w:t>
+            </w:r>
+            <w:r>
+              <w:rPr>
+                <w:rFonts w:ascii="Arial" w:hAnsi="Arial" w:cs="Arial"/>
+              </w:rPr>
+              <w:t>0</w:t>
+            </w:r>
+            <w:r>
+              <w:rPr>
+                <w:rFonts w:ascii="Arial" w:hAnsi="Arial" w:cs="Arial"/>
+              </w:rPr>
+              <w:t xml:space="preserve"> – 11:35</w:t>
             </w:r>
           </w:p>
         </w:tc>
@@ -321,6 +333,12 @@
                 <w:rFonts w:ascii="Arial" w:hAnsi="Arial" w:cs="Arial"/>
               </w:rPr>
             </w:pPr>
+            <w:r>
+              <w:rPr>
+                <w:rFonts w:ascii="Arial" w:hAnsi="Arial" w:cs="Arial"/>
+              </w:rPr>
+              <w:t>Ho continuato a lavorare sulle VM</w:t>
+            </w:r>
           </w:p>
         </w:tc>
       </w:tr>
@@ -391,7 +409,13 @@
               <w:rPr>
                 <w:rFonts w:ascii="Arial" w:hAnsi="Arial" w:cs="Arial"/>
               </w:rPr>
-              <w:t>12:30 – 13:00</w:t>
+              <w:t>12:30 – 1</w:t>
+            </w:r>
+            <w:r>
+              <w:rPr>
+                <w:rFonts w:ascii="Arial" w:hAnsi="Arial" w:cs="Arial"/>
+              </w:rPr>
+              <w:t>5:30</w:t>
             </w:r>
           </w:p>
         </w:tc>
@@ -405,6 +429,12 @@
                 <w:rFonts w:ascii="Arial" w:hAnsi="Arial" w:cs="Arial"/>
               </w:rPr>
             </w:pPr>
+            <w:r>
+              <w:rPr>
+                <w:rFonts w:ascii="Arial" w:hAnsi="Arial" w:cs="Arial"/>
+              </w:rPr>
+              <w:t>Ho configurato le diverse cose su due virtual machine, per la precisione openmediavault e il client, e ho documentato su un file a parte</w:t>
+            </w:r>
           </w:p>
         </w:tc>
       </w:tr>
@@ -426,7 +456,49 @@
               <w:rPr>
                 <w:rFonts w:ascii="Arial" w:hAnsi="Arial" w:cs="Arial"/>
               </w:rPr>
-              <w:t>13:00 – 14:00</w:t>
+              <w:t>1</w:t>
+            </w:r>
+            <w:r>
+              <w:rPr>
+                <w:rFonts w:ascii="Arial" w:hAnsi="Arial" w:cs="Arial"/>
+              </w:rPr>
+              <w:t>5</w:t>
+            </w:r>
+            <w:r>
+              <w:rPr>
+                <w:rFonts w:ascii="Arial" w:hAnsi="Arial" w:cs="Arial"/>
+              </w:rPr>
+              <w:t>:</w:t>
+            </w:r>
+            <w:r>
+              <w:rPr>
+                <w:rFonts w:ascii="Arial" w:hAnsi="Arial" w:cs="Arial"/>
+              </w:rPr>
+              <w:t>3</w:t>
+            </w:r>
+            <w:r>
+              <w:rPr>
+                <w:rFonts w:ascii="Arial" w:hAnsi="Arial" w:cs="Arial"/>
+              </w:rPr>
+              <w:t>0 – 1</w:t>
+            </w:r>
+            <w:r>
+              <w:rPr>
+                <w:rFonts w:ascii="Arial" w:hAnsi="Arial" w:cs="Arial"/>
+              </w:rPr>
+              <w:t>5</w:t>
+            </w:r>
+            <w:r>
+              <w:rPr>
+                <w:rFonts w:ascii="Arial" w:hAnsi="Arial" w:cs="Arial"/>
+              </w:rPr>
+              <w:t>:</w:t>
+            </w:r>
+            <w:r>
+              <w:rPr>
+                <w:rFonts w:ascii="Arial" w:hAnsi="Arial" w:cs="Arial"/>
+              </w:rPr>
+              <w:t>45</w:t>
             </w:r>
           </w:p>
         </w:tc>
@@ -440,76 +512,12 @@
                 <w:rFonts w:ascii="Arial" w:hAnsi="Arial" w:cs="Arial"/>
               </w:rPr>
             </w:pPr>
-          </w:p>
-        </w:tc>
-      </w:tr>
-      <w:tr>
-        <w:trPr>
-          <w:trHeight w:val="258"/>
-        </w:trPr>
-        <w:tc>
-          <w:tcPr>
-            <w:tcW w:w="1696" w:type="dxa"/>
-          </w:tcPr>
-          <w:p>
-            <w:pPr>
-              <w:rPr>
-                <w:rFonts w:ascii="Arial" w:hAnsi="Arial" w:cs="Arial"/>
-              </w:rPr>
-            </w:pPr>
             <w:r>
               <w:rPr>
                 <w:rFonts w:ascii="Arial" w:hAnsi="Arial" w:cs="Arial"/>
               </w:rPr>
-              <w:t>14:15 – 15:25</w:t>
+              <w:t>Ho salvato tutti i file ed eseguito il push su github, inoltre ho scritto il diario</w:t>
             </w:r>
-          </w:p>
-        </w:tc>
-        <w:tc>
-          <w:tcPr>
-            <w:tcW w:w="7932" w:type="dxa"/>
-          </w:tcPr>
-          <w:p>
-            <w:pPr>
-              <w:rPr>
-                <w:rFonts w:ascii="Arial" w:hAnsi="Arial" w:cs="Arial"/>
-              </w:rPr>
-            </w:pPr>
-          </w:p>
-        </w:tc>
-      </w:tr>
-      <w:tr>
-        <w:trPr>
-          <w:trHeight w:val="258"/>
-        </w:trPr>
-        <w:tc>
-          <w:tcPr>
-            <w:tcW w:w="1696" w:type="dxa"/>
-          </w:tcPr>
-          <w:p>
-            <w:pPr>
-              <w:rPr>
-                <w:rFonts w:ascii="Arial" w:hAnsi="Arial" w:cs="Arial"/>
-              </w:rPr>
-            </w:pPr>
-            <w:r>
-              <w:rPr>
-                <w:rFonts w:ascii="Arial" w:hAnsi="Arial" w:cs="Arial"/>
-              </w:rPr>
-              <w:t>15:25 – 15:45</w:t>
-            </w:r>
-          </w:p>
-        </w:tc>
-        <w:tc>
-          <w:tcPr>
-            <w:tcW w:w="7932" w:type="dxa"/>
-          </w:tcPr>
-          <w:p>
-            <w:pPr>
-              <w:rPr>
-                <w:rFonts w:ascii="Arial" w:hAnsi="Arial" w:cs="Arial"/>
-              </w:rPr>
-            </w:pPr>
           </w:p>
         </w:tc>
       </w:tr>
@@ -5298,16 +5306,16 @@
     <w:sig w:usb0="E00006FF" w:usb1="420024FF" w:usb2="02000000" w:usb3="00000000" w:csb0="0000019F" w:csb1="00000000"/>
   </w:font>
   <w:font w:name="Aptos">
-    <w:altName w:val="Calibri"/>
     <w:charset w:val="00"/>
-    <w:family w:val="roman"/>
-    <w:pitch w:val="default"/>
+    <w:family w:val="swiss"/>
+    <w:pitch w:val="variable"/>
+    <w:sig w:usb0="20000287" w:usb1="00000003" w:usb2="00000000" w:usb3="00000000" w:csb0="0000019F" w:csb1="00000000"/>
   </w:font>
   <w:font w:name="Aptos Display">
-    <w:altName w:val="Calibri"/>
     <w:charset w:val="00"/>
-    <w:family w:val="roman"/>
-    <w:pitch w:val="default"/>
+    <w:family w:val="swiss"/>
+    <w:pitch w:val="variable"/>
+    <w:sig w:usb0="20000287" w:usb1="00000003" w:usb2="00000000" w:usb3="00000000" w:csb0="0000019F" w:csb1="00000000"/>
   </w:font>
 </w:fonts>
 </file>
@@ -5468,6 +5476,7 @@
     <w:rsid w:val="00EB36D6"/>
     <w:rsid w:val="00EC6CCE"/>
     <w:rsid w:val="00EE4297"/>
+    <w:rsid w:val="00F1280F"/>
     <w:rsid w:val="00F1629B"/>
     <w:rsid w:val="00F53A00"/>
     <w:rsid w:val="00F902BF"/>

</xml_diff>

<commit_message>
Commit del 23 Ottobre, VM e AD
</commit_message>
<xml_diff>
--- a/4_Diari/261016 Diario Leonardo Montini.docx
+++ b/4_Diari/261016 Diario Leonardo Montini.docx
@@ -225,7 +225,35 @@
               <w:rPr>
                 <w:rFonts w:ascii="Arial" w:hAnsi="Arial" w:cs="Arial"/>
               </w:rPr>
-              <w:t>Ho scaricato i quattro diversi file iso e ho iniziato a creare e configurare una a una le virtual machine, con diverse difficoltà e problematiche.</w:t>
+              <w:t xml:space="preserve">Ho scaricato i quattro diversi file </w:t>
+            </w:r>
+            <w:proofErr w:type="spellStart"/>
+            <w:r>
+              <w:rPr>
+                <w:rFonts w:ascii="Arial" w:hAnsi="Arial" w:cs="Arial"/>
+              </w:rPr>
+              <w:t>iso</w:t>
+            </w:r>
+            <w:proofErr w:type="spellEnd"/>
+            <w:r>
+              <w:rPr>
+                <w:rFonts w:ascii="Arial" w:hAnsi="Arial" w:cs="Arial"/>
+              </w:rPr>
+              <w:t xml:space="preserve"> e ho iniziato a creare e configurare una a una le </w:t>
+            </w:r>
+            <w:proofErr w:type="spellStart"/>
+            <w:r>
+              <w:rPr>
+                <w:rFonts w:ascii="Arial" w:hAnsi="Arial" w:cs="Arial"/>
+              </w:rPr>
+              <w:t>virtual</w:t>
+            </w:r>
+            <w:proofErr w:type="spellEnd"/>
+            <w:r>
+              <w:rPr>
+                <w:rFonts w:ascii="Arial" w:hAnsi="Arial" w:cs="Arial"/>
+              </w:rPr>
+              <w:t xml:space="preserve"> machine, con diverse difficoltà e problematiche.</w:t>
             </w:r>
           </w:p>
         </w:tc>
@@ -433,7 +461,21 @@
               <w:rPr>
                 <w:rFonts w:ascii="Arial" w:hAnsi="Arial" w:cs="Arial"/>
               </w:rPr>
-              <w:t>Ho configurato le diverse cose su due virtual machine, per la precisione openmediavault e il client, e ho documentato su un file a parte</w:t>
+              <w:t xml:space="preserve">Ho configurato le diverse cose su due </w:t>
+            </w:r>
+            <w:proofErr w:type="spellStart"/>
+            <w:r>
+              <w:rPr>
+                <w:rFonts w:ascii="Arial" w:hAnsi="Arial" w:cs="Arial"/>
+              </w:rPr>
+              <w:t>virtual</w:t>
+            </w:r>
+            <w:proofErr w:type="spellEnd"/>
+            <w:r>
+              <w:rPr>
+                <w:rFonts w:ascii="Arial" w:hAnsi="Arial" w:cs="Arial"/>
+              </w:rPr>
+              <w:t xml:space="preserve"> machine, per la precisione openmediavault e il client, e ho documentato su un file a parte</w:t>
             </w:r>
           </w:p>
         </w:tc>
@@ -516,7 +558,35 @@
               <w:rPr>
                 <w:rFonts w:ascii="Arial" w:hAnsi="Arial" w:cs="Arial"/>
               </w:rPr>
-              <w:t>Ho salvato tutti i file ed eseguito il push su github, inoltre ho scritto il diario</w:t>
+              <w:t xml:space="preserve">Ho salvato tutti i file ed eseguito il </w:t>
+            </w:r>
+            <w:proofErr w:type="spellStart"/>
+            <w:r>
+              <w:rPr>
+                <w:rFonts w:ascii="Arial" w:hAnsi="Arial" w:cs="Arial"/>
+              </w:rPr>
+              <w:t>push</w:t>
+            </w:r>
+            <w:proofErr w:type="spellEnd"/>
+            <w:r>
+              <w:rPr>
+                <w:rFonts w:ascii="Arial" w:hAnsi="Arial" w:cs="Arial"/>
+              </w:rPr>
+              <w:t xml:space="preserve"> su </w:t>
+            </w:r>
+            <w:proofErr w:type="spellStart"/>
+            <w:r>
+              <w:rPr>
+                <w:rFonts w:ascii="Arial" w:hAnsi="Arial" w:cs="Arial"/>
+              </w:rPr>
+              <w:t>github</w:t>
+            </w:r>
+            <w:proofErr w:type="spellEnd"/>
+            <w:r>
+              <w:rPr>
+                <w:rFonts w:ascii="Arial" w:hAnsi="Arial" w:cs="Arial"/>
+              </w:rPr>
+              <w:t>, inoltre ho scritto il diario</w:t>
             </w:r>
           </w:p>
         </w:tc>
@@ -609,7 +679,35 @@
               <w:rPr>
                 <w:rFonts w:ascii="Arial" w:hAnsi="Arial" w:cs="Arial"/>
               </w:rPr>
-              <w:t>Ho riscontrato problemi di permessi sul mio SSD personale e ciò non mi permetteva di spostare, eliminare, creare e salvare file su di esso, quindi la creazione di virtual machine era bloccata. Successivamente però il professore mi ha aiutato e tramite le credenziali da amministratore ho potuto assegnare l’accesso completo a “everyone”. Nonostante ciò rimangono dei problemi che continuano a richiedere le credenziali di admin, ma non dovrebbero impedirmi di lavorare</w:t>
+              <w:t xml:space="preserve">Ho riscontrato problemi di permessi sul mio SSD personale e ciò non mi permetteva di spostare, eliminare, creare e salvare file su di esso, quindi la creazione di </w:t>
+            </w:r>
+            <w:proofErr w:type="spellStart"/>
+            <w:r>
+              <w:rPr>
+                <w:rFonts w:ascii="Arial" w:hAnsi="Arial" w:cs="Arial"/>
+              </w:rPr>
+              <w:t>virtual</w:t>
+            </w:r>
+            <w:proofErr w:type="spellEnd"/>
+            <w:r>
+              <w:rPr>
+                <w:rFonts w:ascii="Arial" w:hAnsi="Arial" w:cs="Arial"/>
+              </w:rPr>
+              <w:t xml:space="preserve"> machine era bloccata. Successivamente però il professore mi ha aiutato e tramite le credenziali da amministratore ho potuto assegnare l’accesso completo a “</w:t>
+            </w:r>
+            <w:proofErr w:type="spellStart"/>
+            <w:r>
+              <w:rPr>
+                <w:rFonts w:ascii="Arial" w:hAnsi="Arial" w:cs="Arial"/>
+              </w:rPr>
+              <w:t>everyone</w:t>
+            </w:r>
+            <w:proofErr w:type="spellEnd"/>
+            <w:r>
+              <w:rPr>
+                <w:rFonts w:ascii="Arial" w:hAnsi="Arial" w:cs="Arial"/>
+              </w:rPr>
+              <w:t>”. Nonostante ciò rimangono dei problemi che continuano a richiedere le credenziali di admin, ma non dovrebbero impedirmi di lavorare</w:t>
             </w:r>
           </w:p>
         </w:tc>
@@ -689,6 +787,12 @@
                 <w:rFonts w:ascii="Arial" w:hAnsi="Arial" w:cs="Arial"/>
               </w:rPr>
             </w:pPr>
+            <w:r>
+              <w:rPr>
+                <w:rFonts w:ascii="Arial" w:hAnsi="Arial" w:cs="Arial"/>
+              </w:rPr>
+              <w:t xml:space="preserve">Sono abbastanza in linea con quanto stabilito </w:t>
+            </w:r>
           </w:p>
         </w:tc>
       </w:tr>
@@ -824,7 +928,21 @@
         <w:rPr>
           <w:rFonts w:ascii="Arial" w:hAnsi="Arial" w:cs="Arial"/>
         </w:rPr>
-        <w:t>Creazione di tutte le virtual machine funzionanti</w:t>
+        <w:t xml:space="preserve">Creazione di tutte le </w:t>
+      </w:r>
+      <w:proofErr w:type="spellStart"/>
+      <w:r>
+        <w:rPr>
+          <w:rFonts w:ascii="Arial" w:hAnsi="Arial" w:cs="Arial"/>
+        </w:rPr>
+        <w:t>virtual</w:t>
+      </w:r>
+      <w:proofErr w:type="spellEnd"/>
+      <w:r>
+        <w:rPr>
+          <w:rFonts w:ascii="Arial" w:hAnsi="Arial" w:cs="Arial"/>
+        </w:rPr>
+        <w:t xml:space="preserve"> machine funzionanti</w:t>
       </w:r>
     </w:p>
     <w:sectPr>
@@ -910,7 +1028,23 @@
             <w:rFonts w:eastAsia="Times New Roman" w:cstheme="minorHAnsi"/>
             <w:lang w:val="it-IT" w:eastAsia="fr-FR"/>
           </w:rPr>
-          <w:t>sistema di Backup e Disaster Recovery</w:t>
+          <w:t xml:space="preserve">sistema di Backup e </w:t>
+        </w:r>
+        <w:proofErr w:type="spellStart"/>
+        <w:r>
+          <w:rPr>
+            <w:rFonts w:eastAsia="Times New Roman" w:cstheme="minorHAnsi"/>
+            <w:lang w:val="it-IT" w:eastAsia="fr-FR"/>
+          </w:rPr>
+          <w:t>Disaster</w:t>
+        </w:r>
+        <w:proofErr w:type="spellEnd"/>
+        <w:r>
+          <w:rPr>
+            <w:rFonts w:eastAsia="Times New Roman" w:cstheme="minorHAnsi"/>
+            <w:lang w:val="it-IT" w:eastAsia="fr-FR"/>
+          </w:rPr>
+          <w:t xml:space="preserve"> Recovery</w:t>
         </w:r>
       </w:sdtContent>
     </w:sdt>
@@ -5449,6 +5583,7 @@
     <w:rsid w:val="00B45EE4"/>
     <w:rsid w:val="00B5079C"/>
     <w:rsid w:val="00B6723B"/>
+    <w:rsid w:val="00B90021"/>
     <w:rsid w:val="00BD119E"/>
     <w:rsid w:val="00C22A10"/>
     <w:rsid w:val="00C57AC2"/>

</xml_diff>